<commit_message>
UI for grade calc
</commit_message>
<xml_diff>
--- a/Software_deployment_task4_report.docx
+++ b/Software_deployment_task4_report.docx
@@ -492,7 +492,723 @@
     <w:p>
       <w:r>
         <w:lastRenderedPageBreak/>
-        <w:t>First I have created the app.py file and defined the standard flask routing code which prints a welcome statement on a webpage running on flask, the flask allows connection on any interface.</w:t>
+        <w:t>First,</w:t>
+      </w:r>
+      <w:r>
+        <w:t xml:space="preserve"> I have created the app.py file and defined the standard flask routing code which prints a welcome statement on a webpage running on flask, the flask allows connection on any interface.</w:t>
+      </w:r>
+    </w:p>
+    <w:p>
+      <w:pPr>
+        <w:pStyle w:val="Heading3"/>
+      </w:pPr>
+      <w:r>
+        <w:t>Requirements file</w:t>
+      </w:r>
+    </w:p>
+    <w:p>
+      <w:r>
+        <w:drawing>
+          <wp:inline distT="0" distB="0" distL="0" distR="0" wp14:anchorId="74681FBC" wp14:editId="4217937A">
+            <wp:extent cx="5731510" cy="2921000"/>
+            <wp:effectExtent l="0" t="0" r="2540" b="0"/>
+            <wp:docPr id="514499034" name="Picture 1"/>
+            <wp:cNvGraphicFramePr>
+              <a:graphicFrameLocks xmlns:a="http://schemas.openxmlformats.org/drawingml/2006/main" noChangeAspect="1"/>
+            </wp:cNvGraphicFramePr>
+            <a:graphic xmlns:a="http://schemas.openxmlformats.org/drawingml/2006/main">
+              <a:graphicData uri="http://schemas.openxmlformats.org/drawingml/2006/picture">
+                <pic:pic xmlns:pic="http://schemas.openxmlformats.org/drawingml/2006/picture">
+                  <pic:nvPicPr>
+                    <pic:cNvPr id="514499034" name=""/>
+                    <pic:cNvPicPr/>
+                  </pic:nvPicPr>
+                  <pic:blipFill>
+                    <a:blip r:embed="rId8"/>
+                    <a:stretch>
+                      <a:fillRect/>
+                    </a:stretch>
+                  </pic:blipFill>
+                  <pic:spPr>
+                    <a:xfrm>
+                      <a:off x="0" y="0"/>
+                      <a:ext cx="5731510" cy="2921000"/>
+                    </a:xfrm>
+                    <a:prstGeom prst="rect">
+                      <a:avLst/>
+                    </a:prstGeom>
+                  </pic:spPr>
+                </pic:pic>
+              </a:graphicData>
+            </a:graphic>
+          </wp:inline>
+        </w:drawing>
+      </w:r>
+    </w:p>
+    <w:p>
+      <w:pPr>
+        <w:jc w:val="center"/>
+        <w:rPr>
+          <w:i/>
+          <w:iCs/>
+        </w:rPr>
+      </w:pPr>
+      <w:r>
+        <w:rPr>
+          <w:i/>
+          <w:iCs/>
+        </w:rPr>
+        <w:t>Figure 5, Requirements file</w:t>
+      </w:r>
+    </w:p>
+    <w:p>
+      <w:r>
+        <w:t>Created the requirements.txt file which contains the flask version needed to run the web app. This is for docker when the container spun up it will check the requirements file and makes sure to install all dependencies needed to run the application.</w:t>
+      </w:r>
+    </w:p>
+    <w:p>
+      <w:pPr>
+        <w:pStyle w:val="Heading3"/>
+      </w:pPr>
+      <w:r>
+        <w:t>Docker File</w:t>
+      </w:r>
+    </w:p>
+    <w:p>
+      <w:r>
+        <w:drawing>
+          <wp:inline distT="0" distB="0" distL="0" distR="0" wp14:anchorId="65DF511B" wp14:editId="79044EA7">
+            <wp:extent cx="5731510" cy="3042285"/>
+            <wp:effectExtent l="0" t="0" r="2540" b="5715"/>
+            <wp:docPr id="569480472" name="Picture 1"/>
+            <wp:cNvGraphicFramePr>
+              <a:graphicFrameLocks xmlns:a="http://schemas.openxmlformats.org/drawingml/2006/main" noChangeAspect="1"/>
+            </wp:cNvGraphicFramePr>
+            <a:graphic xmlns:a="http://schemas.openxmlformats.org/drawingml/2006/main">
+              <a:graphicData uri="http://schemas.openxmlformats.org/drawingml/2006/picture">
+                <pic:pic xmlns:pic="http://schemas.openxmlformats.org/drawingml/2006/picture">
+                  <pic:nvPicPr>
+                    <pic:cNvPr id="569480472" name=""/>
+                    <pic:cNvPicPr/>
+                  </pic:nvPicPr>
+                  <pic:blipFill>
+                    <a:blip r:embed="rId9"/>
+                    <a:stretch>
+                      <a:fillRect/>
+                    </a:stretch>
+                  </pic:blipFill>
+                  <pic:spPr>
+                    <a:xfrm>
+                      <a:off x="0" y="0"/>
+                      <a:ext cx="5731510" cy="3042285"/>
+                    </a:xfrm>
+                    <a:prstGeom prst="rect">
+                      <a:avLst/>
+                    </a:prstGeom>
+                  </pic:spPr>
+                </pic:pic>
+              </a:graphicData>
+            </a:graphic>
+          </wp:inline>
+        </w:drawing>
+      </w:r>
+    </w:p>
+    <w:p>
+      <w:pPr>
+        <w:jc w:val="center"/>
+        <w:rPr>
+          <w:i/>
+          <w:iCs/>
+        </w:rPr>
+      </w:pPr>
+      <w:r>
+        <w:rPr>
+          <w:i/>
+          <w:iCs/>
+        </w:rPr>
+        <w:t>Figure 6, Docker file</w:t>
+      </w:r>
+    </w:p>
+    <w:p>
+      <w:r>
+        <w:lastRenderedPageBreak/>
+        <w:t xml:space="preserve">Figure 6 shows the specifications for the Dockerfile defined in the working directory, where it will use a standard python image, create a working directory, download requirements, let docker know which port to listen for and run the python flask application after spinning up the container. </w:t>
+      </w:r>
+    </w:p>
+    <w:p>
+      <w:pPr>
+        <w:pStyle w:val="Heading3"/>
+      </w:pPr>
+      <w:r>
+        <w:t xml:space="preserve">Docker </w:t>
+      </w:r>
+      <w:r>
+        <w:t>Image of flask application</w:t>
+      </w:r>
+    </w:p>
+    <w:p>
+      <w:r>
+        <w:drawing>
+          <wp:inline distT="0" distB="0" distL="0" distR="0" wp14:anchorId="61725939" wp14:editId="22B370ED">
+            <wp:extent cx="5731510" cy="3042920"/>
+            <wp:effectExtent l="0" t="0" r="2540" b="5080"/>
+            <wp:docPr id="1331515305" name="Picture 1"/>
+            <wp:cNvGraphicFramePr>
+              <a:graphicFrameLocks xmlns:a="http://schemas.openxmlformats.org/drawingml/2006/main" noChangeAspect="1"/>
+            </wp:cNvGraphicFramePr>
+            <a:graphic xmlns:a="http://schemas.openxmlformats.org/drawingml/2006/main">
+              <a:graphicData uri="http://schemas.openxmlformats.org/drawingml/2006/picture">
+                <pic:pic xmlns:pic="http://schemas.openxmlformats.org/drawingml/2006/picture">
+                  <pic:nvPicPr>
+                    <pic:cNvPr id="1331515305" name=""/>
+                    <pic:cNvPicPr/>
+                  </pic:nvPicPr>
+                  <pic:blipFill>
+                    <a:blip r:embed="rId10"/>
+                    <a:stretch>
+                      <a:fillRect/>
+                    </a:stretch>
+                  </pic:blipFill>
+                  <pic:spPr>
+                    <a:xfrm>
+                      <a:off x="0" y="0"/>
+                      <a:ext cx="5731510" cy="3042920"/>
+                    </a:xfrm>
+                    <a:prstGeom prst="rect">
+                      <a:avLst/>
+                    </a:prstGeom>
+                  </pic:spPr>
+                </pic:pic>
+              </a:graphicData>
+            </a:graphic>
+          </wp:inline>
+        </w:drawing>
+      </w:r>
+    </w:p>
+    <w:p>
+      <w:pPr>
+        <w:jc w:val="center"/>
+        <w:rPr>
+          <w:i/>
+          <w:iCs/>
+        </w:rPr>
+      </w:pPr>
+      <w:r>
+        <w:rPr>
+          <w:i/>
+          <w:iCs/>
+        </w:rPr>
+        <w:t>Figure 7, Docker Flask Image</w:t>
+      </w:r>
+    </w:p>
+    <w:p>
+      <w:r>
+        <w:t xml:space="preserve">Figure 7 portrays the docker flask image stored in the docker desktop virtualized storage after running the build command to build the template of the flask application, so that when docker spins up containers and use this template to correctly build and configure the application. </w:t>
+      </w:r>
+    </w:p>
+    <w:p>
+      <w:pPr>
+        <w:pStyle w:val="Heading3"/>
+      </w:pPr>
+      <w:r>
+        <w:t xml:space="preserve">Docker </w:t>
+      </w:r>
+      <w:r>
+        <w:t>Container creation</w:t>
+      </w:r>
+    </w:p>
+    <w:p>
+      <w:r>
+        <w:drawing>
+          <wp:inline distT="0" distB="0" distL="0" distR="0" wp14:anchorId="58A28609" wp14:editId="5D36F51A">
+            <wp:extent cx="5731510" cy="3037840"/>
+            <wp:effectExtent l="0" t="0" r="2540" b="0"/>
+            <wp:docPr id="123842065" name="Picture 1"/>
+            <wp:cNvGraphicFramePr>
+              <a:graphicFrameLocks xmlns:a="http://schemas.openxmlformats.org/drawingml/2006/main" noChangeAspect="1"/>
+            </wp:cNvGraphicFramePr>
+            <a:graphic xmlns:a="http://schemas.openxmlformats.org/drawingml/2006/main">
+              <a:graphicData uri="http://schemas.openxmlformats.org/drawingml/2006/picture">
+                <pic:pic xmlns:pic="http://schemas.openxmlformats.org/drawingml/2006/picture">
+                  <pic:nvPicPr>
+                    <pic:cNvPr id="123842065" name=""/>
+                    <pic:cNvPicPr/>
+                  </pic:nvPicPr>
+                  <pic:blipFill>
+                    <a:blip r:embed="rId11"/>
+                    <a:stretch>
+                      <a:fillRect/>
+                    </a:stretch>
+                  </pic:blipFill>
+                  <pic:spPr>
+                    <a:xfrm>
+                      <a:off x="0" y="0"/>
+                      <a:ext cx="5731510" cy="3037840"/>
+                    </a:xfrm>
+                    <a:prstGeom prst="rect">
+                      <a:avLst/>
+                    </a:prstGeom>
+                  </pic:spPr>
+                </pic:pic>
+              </a:graphicData>
+            </a:graphic>
+          </wp:inline>
+        </w:drawing>
+      </w:r>
+    </w:p>
+    <w:p>
+      <w:pPr>
+        <w:jc w:val="center"/>
+        <w:rPr>
+          <w:i/>
+          <w:iCs/>
+        </w:rPr>
+      </w:pPr>
+      <w:r>
+        <w:rPr>
+          <w:i/>
+          <w:iCs/>
+        </w:rPr>
+        <w:t xml:space="preserve">Figure 8, Docker Container </w:t>
+      </w:r>
+    </w:p>
+    <w:p>
+      <w:r>
+        <w:lastRenderedPageBreak/>
+        <w:t xml:space="preserve">The docker container was then created with the application image illustrated in figure 7, I have also mapped the ports so that to access the container I would access through the same port the flask web server is running on to simplify the accessibility. </w:t>
+      </w:r>
+    </w:p>
+    <w:p>
+      <w:pPr>
+        <w:pStyle w:val="Heading3"/>
+      </w:pPr>
+      <w:r>
+        <w:t>Flask App on docker</w:t>
+      </w:r>
+    </w:p>
+    <w:p>
+      <w:r>
+        <w:drawing>
+          <wp:inline distT="0" distB="0" distL="0" distR="0" wp14:anchorId="7E33FF70" wp14:editId="3B403AA2">
+            <wp:extent cx="5731510" cy="2947035"/>
+            <wp:effectExtent l="0" t="0" r="2540" b="5715"/>
+            <wp:docPr id="505243911" name="Picture 1"/>
+            <wp:cNvGraphicFramePr>
+              <a:graphicFrameLocks xmlns:a="http://schemas.openxmlformats.org/drawingml/2006/main" noChangeAspect="1"/>
+            </wp:cNvGraphicFramePr>
+            <a:graphic xmlns:a="http://schemas.openxmlformats.org/drawingml/2006/main">
+              <a:graphicData uri="http://schemas.openxmlformats.org/drawingml/2006/picture">
+                <pic:pic xmlns:pic="http://schemas.openxmlformats.org/drawingml/2006/picture">
+                  <pic:nvPicPr>
+                    <pic:cNvPr id="505243911" name=""/>
+                    <pic:cNvPicPr/>
+                  </pic:nvPicPr>
+                  <pic:blipFill>
+                    <a:blip r:embed="rId12"/>
+                    <a:stretch>
+                      <a:fillRect/>
+                    </a:stretch>
+                  </pic:blipFill>
+                  <pic:spPr>
+                    <a:xfrm>
+                      <a:off x="0" y="0"/>
+                      <a:ext cx="5731510" cy="2947035"/>
+                    </a:xfrm>
+                    <a:prstGeom prst="rect">
+                      <a:avLst/>
+                    </a:prstGeom>
+                  </pic:spPr>
+                </pic:pic>
+              </a:graphicData>
+            </a:graphic>
+          </wp:inline>
+        </w:drawing>
+      </w:r>
+    </w:p>
+    <w:p>
+      <w:r>
+        <w:drawing>
+          <wp:inline distT="0" distB="0" distL="0" distR="0" wp14:anchorId="3D001051" wp14:editId="43BF43F2">
+            <wp:extent cx="5731510" cy="1146175"/>
+            <wp:effectExtent l="0" t="0" r="2540" b="0"/>
+            <wp:docPr id="615143995" name="Picture 1"/>
+            <wp:cNvGraphicFramePr>
+              <a:graphicFrameLocks xmlns:a="http://schemas.openxmlformats.org/drawingml/2006/main" noChangeAspect="1"/>
+            </wp:cNvGraphicFramePr>
+            <a:graphic xmlns:a="http://schemas.openxmlformats.org/drawingml/2006/main">
+              <a:graphicData uri="http://schemas.openxmlformats.org/drawingml/2006/picture">
+                <pic:pic xmlns:pic="http://schemas.openxmlformats.org/drawingml/2006/picture">
+                  <pic:nvPicPr>
+                    <pic:cNvPr id="615143995" name=""/>
+                    <pic:cNvPicPr/>
+                  </pic:nvPicPr>
+                  <pic:blipFill>
+                    <a:blip r:embed="rId13"/>
+                    <a:stretch>
+                      <a:fillRect/>
+                    </a:stretch>
+                  </pic:blipFill>
+                  <pic:spPr>
+                    <a:xfrm>
+                      <a:off x="0" y="0"/>
+                      <a:ext cx="5731510" cy="1146175"/>
+                    </a:xfrm>
+                    <a:prstGeom prst="rect">
+                      <a:avLst/>
+                    </a:prstGeom>
+                  </pic:spPr>
+                </pic:pic>
+              </a:graphicData>
+            </a:graphic>
+          </wp:inline>
+        </w:drawing>
+      </w:r>
+    </w:p>
+    <w:p>
+      <w:pPr>
+        <w:jc w:val="center"/>
+        <w:rPr>
+          <w:i/>
+          <w:iCs/>
+        </w:rPr>
+      </w:pPr>
+      <w:r>
+        <w:rPr>
+          <w:i/>
+          <w:iCs/>
+        </w:rPr>
+        <w:t>Figure 9, Containerized Flask app</w:t>
+      </w:r>
+    </w:p>
+    <w:p>
+      <w:r>
+        <w:t>Figure 9 shows that the flask app is accessible but also the docker logs highlight that the web is app is successfully running on a docker container.</w:t>
+      </w:r>
+    </w:p>
+    <w:p>
+      <w:pPr>
+        <w:pStyle w:val="Heading3"/>
+      </w:pPr>
+      <w:r>
+        <w:lastRenderedPageBreak/>
+        <w:t>Docker repo</w:t>
+      </w:r>
+    </w:p>
+    <w:p>
+      <w:r>
+        <w:drawing>
+          <wp:inline distT="0" distB="0" distL="0" distR="0" wp14:anchorId="39B76699" wp14:editId="075AA5E5">
+            <wp:extent cx="5731510" cy="2651760"/>
+            <wp:effectExtent l="0" t="0" r="2540" b="0"/>
+            <wp:docPr id="1421726574" name="Picture 1"/>
+            <wp:cNvGraphicFramePr>
+              <a:graphicFrameLocks xmlns:a="http://schemas.openxmlformats.org/drawingml/2006/main" noChangeAspect="1"/>
+            </wp:cNvGraphicFramePr>
+            <a:graphic xmlns:a="http://schemas.openxmlformats.org/drawingml/2006/main">
+              <a:graphicData uri="http://schemas.openxmlformats.org/drawingml/2006/picture">
+                <pic:pic xmlns:pic="http://schemas.openxmlformats.org/drawingml/2006/picture">
+                  <pic:nvPicPr>
+                    <pic:cNvPr id="1421726574" name=""/>
+                    <pic:cNvPicPr/>
+                  </pic:nvPicPr>
+                  <pic:blipFill>
+                    <a:blip r:embed="rId14"/>
+                    <a:stretch>
+                      <a:fillRect/>
+                    </a:stretch>
+                  </pic:blipFill>
+                  <pic:spPr>
+                    <a:xfrm>
+                      <a:off x="0" y="0"/>
+                      <a:ext cx="5731510" cy="2651760"/>
+                    </a:xfrm>
+                    <a:prstGeom prst="rect">
+                      <a:avLst/>
+                    </a:prstGeom>
+                  </pic:spPr>
+                </pic:pic>
+              </a:graphicData>
+            </a:graphic>
+          </wp:inline>
+        </w:drawing>
+      </w:r>
+    </w:p>
+    <w:p>
+      <w:pPr>
+        <w:jc w:val="center"/>
+        <w:rPr>
+          <w:i/>
+          <w:iCs/>
+        </w:rPr>
+      </w:pPr>
+      <w:r>
+        <w:rPr>
+          <w:i/>
+          <w:iCs/>
+        </w:rPr>
+        <w:t>Figure 10, Repo</w:t>
+      </w:r>
+    </w:p>
+    <w:p>
+      <w:r>
+        <w:t xml:space="preserve">Create a repo on docker hub to be able to push the image to. </w:t>
+      </w:r>
+    </w:p>
+    <w:p>
+      <w:pPr>
+        <w:pStyle w:val="Heading3"/>
+      </w:pPr>
+      <w:r>
+        <w:t>Push image</w:t>
+      </w:r>
+    </w:p>
+    <w:p>
+      <w:pPr>
+        <w:pStyle w:val="Heading1"/>
+      </w:pPr>
+      <w:r>
+        <w:drawing>
+          <wp:inline distT="0" distB="0" distL="0" distR="0" wp14:anchorId="2BC55FC5" wp14:editId="22C631F5">
+            <wp:extent cx="5731510" cy="3013710"/>
+            <wp:effectExtent l="0" t="0" r="2540" b="0"/>
+            <wp:docPr id="864279475" name="Picture 1"/>
+            <wp:cNvGraphicFramePr>
+              <a:graphicFrameLocks xmlns:a="http://schemas.openxmlformats.org/drawingml/2006/main" noChangeAspect="1"/>
+            </wp:cNvGraphicFramePr>
+            <a:graphic xmlns:a="http://schemas.openxmlformats.org/drawingml/2006/main">
+              <a:graphicData uri="http://schemas.openxmlformats.org/drawingml/2006/picture">
+                <pic:pic xmlns:pic="http://schemas.openxmlformats.org/drawingml/2006/picture">
+                  <pic:nvPicPr>
+                    <pic:cNvPr id="864279475" name=""/>
+                    <pic:cNvPicPr/>
+                  </pic:nvPicPr>
+                  <pic:blipFill>
+                    <a:blip r:embed="rId15"/>
+                    <a:stretch>
+                      <a:fillRect/>
+                    </a:stretch>
+                  </pic:blipFill>
+                  <pic:spPr>
+                    <a:xfrm>
+                      <a:off x="0" y="0"/>
+                      <a:ext cx="5731510" cy="3013710"/>
+                    </a:xfrm>
+                    <a:prstGeom prst="rect">
+                      <a:avLst/>
+                    </a:prstGeom>
+                  </pic:spPr>
+                </pic:pic>
+              </a:graphicData>
+            </a:graphic>
+          </wp:inline>
+        </w:drawing>
+      </w:r>
+    </w:p>
+    <w:p>
+      <w:pPr>
+        <w:jc w:val="center"/>
+        <w:rPr>
+          <w:i/>
+          <w:iCs/>
+        </w:rPr>
+      </w:pPr>
+      <w:r>
+        <w:rPr>
+          <w:i/>
+          <w:iCs/>
+        </w:rPr>
+        <w:t>Figure 11, Pushed image</w:t>
+      </w:r>
+    </w:p>
+    <w:p>
+      <w:r>
+        <w:t>Figure 10 shows the repo now storing the flask image, this can now be used for a secondary docker host</w:t>
+      </w:r>
+    </w:p>
+    <w:p/>
+    <w:p>
+      <w:pPr>
+        <w:pStyle w:val="Heading3"/>
+      </w:pPr>
+      <w:r>
+        <w:lastRenderedPageBreak/>
+        <w:t xml:space="preserve">Login on docker on new environment </w:t>
+      </w:r>
+    </w:p>
+    <w:p>
+      <w:r>
+        <w:rPr>
+          <w:noProof/>
+        </w:rPr>
+        <w:drawing>
+          <wp:inline distT="0" distB="0" distL="0" distR="0" wp14:anchorId="6BA947BE" wp14:editId="77DC42BA">
+            <wp:extent cx="5731510" cy="2310765"/>
+            <wp:effectExtent l="0" t="0" r="2540" b="0"/>
+            <wp:docPr id="1445739548" name="Picture 2"/>
+            <wp:cNvGraphicFramePr>
+              <a:graphicFrameLocks xmlns:a="http://schemas.openxmlformats.org/drawingml/2006/main" noChangeAspect="1"/>
+            </wp:cNvGraphicFramePr>
+            <a:graphic xmlns:a="http://schemas.openxmlformats.org/drawingml/2006/main">
+              <a:graphicData uri="http://schemas.openxmlformats.org/drawingml/2006/picture">
+                <pic:pic xmlns:pic="http://schemas.openxmlformats.org/drawingml/2006/picture">
+                  <pic:nvPicPr>
+                    <pic:cNvPr id="0" name="Picture 6"/>
+                    <pic:cNvPicPr>
+                      <a:picLocks noChangeAspect="1" noChangeArrowheads="1"/>
+                    </pic:cNvPicPr>
+                  </pic:nvPicPr>
+                  <pic:blipFill>
+                    <a:blip r:embed="rId16">
+                      <a:extLst>
+                        <a:ext uri="{28A0092B-C50C-407E-A947-70E740481C1C}">
+                          <a14:useLocalDpi xmlns:a14="http://schemas.microsoft.com/office/drawing/2010/main" val="0"/>
+                        </a:ext>
+                      </a:extLst>
+                    </a:blip>
+                    <a:srcRect/>
+                    <a:stretch>
+                      <a:fillRect/>
+                    </a:stretch>
+                  </pic:blipFill>
+                  <pic:spPr bwMode="auto">
+                    <a:xfrm>
+                      <a:off x="0" y="0"/>
+                      <a:ext cx="5731510" cy="2310765"/>
+                    </a:xfrm>
+                    <a:prstGeom prst="rect">
+                      <a:avLst/>
+                    </a:prstGeom>
+                    <a:noFill/>
+                    <a:ln>
+                      <a:noFill/>
+                    </a:ln>
+                  </pic:spPr>
+                </pic:pic>
+              </a:graphicData>
+            </a:graphic>
+          </wp:inline>
+        </w:drawing>
+      </w:r>
+    </w:p>
+    <w:p>
+      <w:pPr>
+        <w:jc w:val="center"/>
+        <w:rPr>
+          <w:i/>
+          <w:iCs/>
+        </w:rPr>
+      </w:pPr>
+      <w:r>
+        <w:rPr>
+          <w:i/>
+          <w:iCs/>
+        </w:rPr>
+        <w:t>Figure 12, New environment</w:t>
+      </w:r>
+    </w:p>
+    <w:p>
+      <w:r>
+        <w:t>Figure 12 shows logging into a new docker account and then pulling the image from the public repo</w:t>
+      </w:r>
+    </w:p>
+    <w:p>
+      <w:pPr>
+        <w:pStyle w:val="Heading3"/>
+      </w:pPr>
+      <w:r>
+        <w:t>Running Docker container on different environments</w:t>
+      </w:r>
+    </w:p>
+    <w:p>
+      <w:r>
+        <w:drawing>
+          <wp:inline distT="0" distB="0" distL="0" distR="0" wp14:anchorId="44202BED" wp14:editId="089EA40A">
+            <wp:extent cx="5731510" cy="3051175"/>
+            <wp:effectExtent l="0" t="0" r="2540" b="0"/>
+            <wp:docPr id="2120572219" name="Picture 1"/>
+            <wp:cNvGraphicFramePr>
+              <a:graphicFrameLocks xmlns:a="http://schemas.openxmlformats.org/drawingml/2006/main" noChangeAspect="1"/>
+            </wp:cNvGraphicFramePr>
+            <a:graphic xmlns:a="http://schemas.openxmlformats.org/drawingml/2006/main">
+              <a:graphicData uri="http://schemas.openxmlformats.org/drawingml/2006/picture">
+                <pic:pic xmlns:pic="http://schemas.openxmlformats.org/drawingml/2006/picture">
+                  <pic:nvPicPr>
+                    <pic:cNvPr id="2120572219" name=""/>
+                    <pic:cNvPicPr/>
+                  </pic:nvPicPr>
+                  <pic:blipFill>
+                    <a:blip r:embed="rId17"/>
+                    <a:stretch>
+                      <a:fillRect/>
+                    </a:stretch>
+                  </pic:blipFill>
+                  <pic:spPr>
+                    <a:xfrm>
+                      <a:off x="0" y="0"/>
+                      <a:ext cx="5731510" cy="3051175"/>
+                    </a:xfrm>
+                    <a:prstGeom prst="rect">
+                      <a:avLst/>
+                    </a:prstGeom>
+                  </pic:spPr>
+                </pic:pic>
+              </a:graphicData>
+            </a:graphic>
+          </wp:inline>
+        </w:drawing>
+      </w:r>
+    </w:p>
+    <w:p>
+      <w:r>
+        <w:lastRenderedPageBreak/>
+        <w:drawing>
+          <wp:inline distT="0" distB="0" distL="0" distR="0" wp14:anchorId="5BE8D849" wp14:editId="71E14B74">
+            <wp:extent cx="5731510" cy="2974340"/>
+            <wp:effectExtent l="0" t="0" r="2540" b="0"/>
+            <wp:docPr id="1069651624" name="Picture 1"/>
+            <wp:cNvGraphicFramePr>
+              <a:graphicFrameLocks xmlns:a="http://schemas.openxmlformats.org/drawingml/2006/main" noChangeAspect="1"/>
+            </wp:cNvGraphicFramePr>
+            <a:graphic xmlns:a="http://schemas.openxmlformats.org/drawingml/2006/main">
+              <a:graphicData uri="http://schemas.openxmlformats.org/drawingml/2006/picture">
+                <pic:pic xmlns:pic="http://schemas.openxmlformats.org/drawingml/2006/picture">
+                  <pic:nvPicPr>
+                    <pic:cNvPr id="1069651624" name=""/>
+                    <pic:cNvPicPr/>
+                  </pic:nvPicPr>
+                  <pic:blipFill>
+                    <a:blip r:embed="rId18"/>
+                    <a:stretch>
+                      <a:fillRect/>
+                    </a:stretch>
+                  </pic:blipFill>
+                  <pic:spPr>
+                    <a:xfrm>
+                      <a:off x="0" y="0"/>
+                      <a:ext cx="5731510" cy="2974340"/>
+                    </a:xfrm>
+                    <a:prstGeom prst="rect">
+                      <a:avLst/>
+                    </a:prstGeom>
+                  </pic:spPr>
+                </pic:pic>
+              </a:graphicData>
+            </a:graphic>
+          </wp:inline>
+        </w:drawing>
+      </w:r>
+    </w:p>
+    <w:p>
+      <w:pPr>
+        <w:jc w:val="center"/>
+      </w:pPr>
+      <w:r>
+        <w:t>Figure 13, Different environments</w:t>
+      </w:r>
+    </w:p>
+    <w:p>
+      <w:r>
+        <w:t>Figure 13 highlights the containers being able to run on different environments after demonstrating that the image of the flask web app can be pulled from the public docker repository online and used to spin up a container. Furthermore, this is shown through the different computing specifications shown in task manager which is evidence of multi environment.</w:t>
       </w:r>
     </w:p>
     <w:p/>
@@ -510,7 +1226,7 @@
       <w:r>
         <w:t xml:space="preserve">GitHub repository: </w:t>
       </w:r>
-      <w:hyperlink r:id="rId8" w:history="1">
+      <w:hyperlink r:id="rId19" w:history="1">
         <w:r>
           <w:rPr>
             <w:rStyle w:val="Hyperlink"/>

</xml_diff>